<commit_message>
Add Power BI (Accelo) to master profile; propagate to micro1 application
Josh confirmed hands-on Power BI use at Accelo, building and demonstrating
dashboards that showed how Accelo's API could sync live platform data into
client BI reporting. Added to the master profile so it carries into all
future applications.

- master-profile: new Accelo bullet + Power BI in competency banks
- resume: Power BI bullet and Analytics section; trimmed two lower-value
  bullets to hold balanced 2 pages (fill 0.97)
- fit: 84 -> 86, closes preferred qual #6 (BI tooling)
- match-report: BI gap marked closed, Snowflake row downgraded to adjacent
- interview-prep: Power BI removed from do-not-claim; added the API-to-BI
  callback as a connector-section answer

Co-Authored-By: Claude Opus 5 <noreply@anthropic.com>
Claude-Session: https://claude.ai/code/session_01TQfwY6zBRw44ZR847mtyAG
</commit_message>
<xml_diff>
--- a/applications/micro1-workflow-annotator-pm-marketing/resume.docx
+++ b/applications/micro1-workflow-annotator-pm-marketing/resume.docx
@@ -452,30 +452,6 @@
     </w:p>
     <w:p>
       <w:pPr>
-        <w:spacing w:after="30"/>
-        <w:ind w:left="259" w:hanging="259"/>
-      </w:pPr>
-      <w:r>
-        <w:rPr>
-          <w:rFonts w:ascii="Calibri" w:hAnsi="Calibri"/>
-          <w:b w:val="0"/>
-          <w:i w:val="0"/>
-          <w:color w:val="163A5F"/>
-        </w:rPr>
-        <w:t xml:space="preserve">•  </w:t>
-      </w:r>
-      <w:r>
-        <w:rPr>
-          <w:rFonts w:ascii="Calibri" w:hAnsi="Calibri"/>
-          <w:b w:val="0"/>
-          <w:i w:val="0"/>
-          <w:color w:val="1A1A1A"/>
-        </w:rPr>
-        <w:t>Translated performance data into strategic recommendations for multi-stakeholder accounts spanning marketing and technology channels.</w:t>
-      </w:r>
-    </w:p>
-    <w:p>
-      <w:pPr>
         <w:tabs>
           <w:tab w:pos="10512" w:val="right"/>
         </w:tabs>
@@ -597,31 +573,7 @@
           <w:i w:val="0"/>
           <w:color w:val="1A1A1A"/>
         </w:rPr>
-        <w:t>Onboarded and managed 15–20 reseller partners (deal sizes ~$10K–$45K), retaining all but one (~94% retention) during tenure.</w:t>
-      </w:r>
-    </w:p>
-    <w:p>
-      <w:pPr>
-        <w:spacing w:after="30"/>
-        <w:ind w:left="259" w:hanging="259"/>
-      </w:pPr>
-      <w:r>
-        <w:rPr>
-          <w:rFonts w:ascii="Calibri" w:hAnsi="Calibri"/>
-          <w:b w:val="0"/>
-          <w:i w:val="0"/>
-          <w:color w:val="163A5F"/>
-        </w:rPr>
-        <w:t xml:space="preserve">•  </w:t>
-      </w:r>
-      <w:r>
-        <w:rPr>
-          <w:rFonts w:ascii="Calibri" w:hAnsi="Calibri"/>
-          <w:b w:val="0"/>
-          <w:i w:val="0"/>
-          <w:color w:val="1A1A1A"/>
-        </w:rPr>
-        <w:t>Analyzed partner utilization and performance metrics to identify adoption gaps and recommend interventions that reduced churn.</w:t>
+        <w:t>Onboarded and managed 15–20 reseller partners (deal sizes ~$10K–$45K), retaining all but one (~94% retention) while analyzing utilization metrics to identify adoption gaps and reduce churn.</w:t>
       </w:r>
     </w:p>
     <w:p>
@@ -951,6 +903,30 @@
           <w:i w:val="0"/>
           <w:color w:val="1A1A1A"/>
         </w:rPr>
+        <w:t>Built and demonstrated Power BI dashboards showing how Accelo's API could sync live platform data into client BI reporting — translating raw system data into the reporting view a stakeholder actually needed.</w:t>
+      </w:r>
+    </w:p>
+    <w:p>
+      <w:pPr>
+        <w:spacing w:after="30"/>
+        <w:ind w:left="259" w:hanging="259"/>
+      </w:pPr>
+      <w:r>
+        <w:rPr>
+          <w:rFonts w:ascii="Calibri" w:hAnsi="Calibri"/>
+          <w:b w:val="0"/>
+          <w:i w:val="0"/>
+          <w:color w:val="163A5F"/>
+        </w:rPr>
+        <w:t xml:space="preserve">•  </w:t>
+      </w:r>
+      <w:r>
+        <w:rPr>
+          <w:rFonts w:ascii="Calibri" w:hAnsi="Calibri"/>
+          <w:b w:val="0"/>
+          <w:i w:val="0"/>
+          <w:color w:val="1A1A1A"/>
+        </w:rPr>
         <w:t>Guided client onboarding, workflow design, and API integrations, advising C-suite executives as a trusted advisor on operational system design.</w:t>
       </w:r>
     </w:p>
@@ -1256,7 +1232,7 @@
           <w:i w:val="0"/>
           <w:color w:val="1A1A1A"/>
         </w:rPr>
-        <w:t xml:space="preserve">Analytics &amp; Marketing Stack:  </w:t>
+        <w:t xml:space="preserve">Analytics &amp; Reporting:  </w:t>
       </w:r>
       <w:r>
         <w:rPr>
@@ -1265,7 +1241,30 @@
           <w:i w:val="0"/>
           <w:color w:val="1A1A1A"/>
         </w:rPr>
-        <w:t>GA4, Google Search Console, GoHighLevel, HubSpot, Salesforce, KPI Tracking, Campaign Attribution, ROI Dashboards</w:t>
+        <w:t>Power BI, GA4, Google Search Console, API-to-BI Data Syncing, KPI Tracking, Campaign Attribution, ROI Dashboards, Executive Readouts</w:t>
+      </w:r>
+    </w:p>
+    <w:p>
+      <w:pPr>
+        <w:spacing w:after="30"/>
+      </w:pPr>
+      <w:r>
+        <w:rPr>
+          <w:rFonts w:ascii="Calibri" w:hAnsi="Calibri"/>
+          <w:b/>
+          <w:i w:val="0"/>
+          <w:color w:val="1A1A1A"/>
+        </w:rPr>
+        <w:t xml:space="preserve">Marketing Stack:  </w:t>
+      </w:r>
+      <w:r>
+        <w:rPr>
+          <w:rFonts w:ascii="Calibri" w:hAnsi="Calibri"/>
+          <w:b w:val="0"/>
+          <w:i w:val="0"/>
+          <w:color w:val="1A1A1A"/>
+        </w:rPr>
+        <w:t>GoHighLevel, HubSpot, Salesforce, Notion, GitHub (MCP), Google Drive</w:t>
       </w:r>
     </w:p>
     <w:p>

</xml_diff>